<commit_message>
feat: add debug and fix some error
</commit_message>
<xml_diff>
--- a/Gemini_API/SlideGenFunctionCalling/Document/VẤN ĐỀ VỀ CHỦ QUYỀN BIỂN ĐẢO VIỆT NAM.docx
+++ b/Gemini_API/SlideGenFunctionCalling/Document/VẤN ĐỀ VỀ CHỦ QUYỀN BIỂN ĐẢO VIỆT NAM.docx
@@ -1,31 +1,45 @@
 
 <file path=word/document.xml><?xml version="1.0" encoding="utf-8"?>
-<w:document xmlns:wpc="http://schemas.microsoft.com/office/word/2010/wordprocessingCanvas" xmlns:cx="http://schemas.microsoft.com/office/drawing/2014/chartex" xmlns:mc="http://schemas.openxmlformats.org/markup-compatibility/2006" xmlns:o="urn:schemas-microsoft-com:office:office" xmlns:r="http://schemas.openxmlformats.org/officeDocument/2006/relationships" xmlns:m="http://schemas.openxmlformats.org/officeDocument/2006/math" xmlns:v="urn:schemas-microsoft-com:vml" xmlns:wp14="http://schemas.microsoft.com/office/word/2010/wordprocessingDrawing" xmlns:wp="http://schemas.openxmlformats.org/drawingml/2006/wordprocessingDrawing" xmlns:w10="urn:schemas-microsoft-com:office:word" xmlns:w="http://schemas.openxmlformats.org/wordprocessingml/2006/main" xmlns:w14="http://schemas.microsoft.com/office/word/2010/wordml" xmlns:w15="http://schemas.microsoft.com/office/word/2012/wordml" xmlns:w16se="http://schemas.microsoft.com/office/word/2015/wordml/symex" xmlns:wpg="http://schemas.microsoft.com/office/word/2010/wordprocessingGroup" xmlns:wpi="http://schemas.microsoft.com/office/word/2010/wordprocessingInk" xmlns:wne="http://schemas.microsoft.com/office/word/2006/wordml" xmlns:wps="http://schemas.microsoft.com/office/word/2010/wordprocessingShape" mc:Ignorable="w14 w15 w16se wp14">
+<w:document xmlns:wpc="http://schemas.microsoft.com/office/word/2010/wordprocessingCanvas" xmlns:cx="http://schemas.microsoft.com/office/drawing/2014/chartex" xmlns:cx1="http://schemas.microsoft.com/office/drawing/2015/9/8/chartex" xmlns:cx2="http://schemas.microsoft.com/office/drawing/2015/10/21/chartex" xmlns:cx3="http://schemas.microsoft.com/office/drawing/2016/5/9/chartex" xmlns:cx4="http://schemas.microsoft.com/office/drawing/2016/5/10/chartex" xmlns:cx5="http://schemas.microsoft.com/office/drawing/2016/5/11/chartex" xmlns:cx6="http://schemas.microsoft.com/office/drawing/2016/5/12/chartex" xmlns:cx7="http://schemas.microsoft.com/office/drawing/2016/5/13/chartex" xmlns:cx8="http://schemas.microsoft.com/office/drawing/2016/5/14/chartex" xmlns:mc="http://schemas.openxmlformats.org/markup-compatibility/2006" xmlns:aink="http://schemas.microsoft.com/office/drawing/2016/ink" xmlns:am3d="http://schemas.microsoft.com/office/drawing/2017/model3d" xmlns:o="urn:schemas-microsoft-com:office:office" xmlns:oel="http://schemas.microsoft.com/office/2019/extlst" xmlns:r="http://schemas.openxmlformats.org/officeDocument/2006/relationships" xmlns:m="http://schemas.openxmlformats.org/officeDocument/2006/math" xmlns:v="urn:schemas-microsoft-com:vml" xmlns:wp14="http://schemas.microsoft.com/office/word/2010/wordprocessingDrawing" xmlns:wp="http://schemas.openxmlformats.org/drawingml/2006/wordprocessingDrawing" xmlns:w10="urn:schemas-microsoft-com:office:word" xmlns:w="http://schemas.openxmlformats.org/wordprocessingml/2006/main" xmlns:w14="http://schemas.microsoft.com/office/word/2010/wordml" xmlns:w15="http://schemas.microsoft.com/office/word/2012/wordml" xmlns:w16cex="http://schemas.microsoft.com/office/word/2018/wordml/cex" xmlns:w16cid="http://schemas.microsoft.com/office/word/2016/wordml/cid" xmlns:w16="http://schemas.microsoft.com/office/word/2018/wordml" xmlns:w16sdtdh="http://schemas.microsoft.com/office/word/2020/wordml/sdtdatahash" xmlns:w16se="http://schemas.microsoft.com/office/word/2015/wordml/symex" xmlns:wpg="http://schemas.microsoft.com/office/word/2010/wordprocessingGroup" xmlns:wpi="http://schemas.microsoft.com/office/word/2010/wordprocessingInk" xmlns:wne="http://schemas.microsoft.com/office/word/2006/wordml" xmlns:wps="http://schemas.microsoft.com/office/word/2010/wordprocessingShape" mc:Ignorable="w14 w15 w16se w16cid w16 w16cex w16sdtdh wp14">
   <w:body>
     <w:p>
       <w:pPr>
-        <w:spacing w:before="100" w:beforeAutospacing="1" w:after="100" w:afterAutospacing="1" w:line="240" w:lineRule="auto"/>
-        <w:rPr>
-          <w:rFonts w:ascii="Times New Roman" w:eastAsia="Times New Roman" w:hAnsi="Times New Roman" w:cs="Times New Roman"/>
-          <w:sz w:val="24"/>
-          <w:szCs w:val="24"/>
-        </w:rPr>
-      </w:pPr>
-      <w:r>
-        <w:rPr>
-          <w:rFonts w:ascii="Times New Roman" w:eastAsia="Times New Roman" w:hAnsi="Times New Roman" w:cs="Times New Roman"/>
-          <w:bCs/>
-          <w:sz w:val="24"/>
-          <w:szCs w:val="24"/>
+        <w:pStyle w:val="Title"/>
+        <w:rPr>
+          <w:rFonts w:eastAsia="Times New Roman"/>
+          <w:lang w:val="vi-VN"/>
+        </w:rPr>
+      </w:pPr>
+      <w:r>
+        <w:rPr>
+          <w:rFonts w:eastAsia="Times New Roman"/>
+        </w:rPr>
+        <w:t>Vấn</w:t>
+      </w:r>
+      <w:r>
+        <w:rPr>
+          <w:rFonts w:eastAsia="Times New Roman"/>
+          <w:lang w:val="vi-VN"/>
+        </w:rPr>
+        <w:t xml:space="preserve"> đề về chủ quyền biển đảo Việt Nam</w:t>
+      </w:r>
+    </w:p>
+    <w:p>
+      <w:pPr>
+        <w:pStyle w:val="Heading1"/>
+        <w:rPr>
+          <w:rFonts w:eastAsia="Times New Roman"/>
+        </w:rPr>
+      </w:pPr>
+      <w:r>
+        <w:rPr>
+          <w:rFonts w:eastAsia="Times New Roman"/>
         </w:rPr>
         <w:t>Mở đầu</w:t>
       </w:r>
       <w:r>
         <w:rPr>
-          <w:rFonts w:ascii="Times New Roman" w:eastAsia="Times New Roman" w:hAnsi="Times New Roman" w:cs="Times New Roman"/>
-          <w:bCs/>
-          <w:sz w:val="24"/>
-          <w:szCs w:val="24"/>
+          <w:rFonts w:eastAsia="Times New Roman"/>
         </w:rPr>
         <w:t>:</w:t>
       </w:r>
@@ -50,21 +64,14 @@
     </w:p>
     <w:p>
       <w:pPr>
-        <w:spacing w:before="100" w:beforeAutospacing="1" w:after="100" w:afterAutospacing="1" w:line="240" w:lineRule="auto"/>
-        <w:outlineLvl w:val="2"/>
-        <w:rPr>
-          <w:rFonts w:ascii="Times New Roman" w:eastAsia="Times New Roman" w:hAnsi="Times New Roman" w:cs="Times New Roman"/>
-          <w:bCs/>
-          <w:sz w:val="27"/>
-          <w:szCs w:val="27"/>
-        </w:rPr>
-      </w:pPr>
-      <w:r>
-        <w:rPr>
-          <w:rFonts w:ascii="Times New Roman" w:eastAsia="Times New Roman" w:hAnsi="Times New Roman" w:cs="Times New Roman"/>
-          <w:bCs/>
-          <w:sz w:val="27"/>
-          <w:szCs w:val="27"/>
+        <w:pStyle w:val="Heading1"/>
+        <w:rPr>
+          <w:rFonts w:eastAsia="Times New Roman"/>
+        </w:rPr>
+      </w:pPr>
+      <w:r>
+        <w:rPr>
+          <w:rFonts w:eastAsia="Times New Roman"/>
         </w:rPr>
         <w:t>Phần 1: Chủ quyền biển đảo Việt Nam là gì?</w:t>
       </w:r>
@@ -158,8 +165,6 @@
         </w:rPr>
         <w:t>Các căn cứ pháp lý</w:t>
       </w:r>
-      <w:bookmarkStart w:id="0" w:name="_GoBack"/>
-      <w:bookmarkEnd w:id="0"/>
     </w:p>
     <w:p>
       <w:pPr>
@@ -257,21 +262,14 @@
     </w:p>
     <w:p>
       <w:pPr>
-        <w:spacing w:before="100" w:beforeAutospacing="1" w:after="100" w:afterAutospacing="1" w:line="240" w:lineRule="auto"/>
-        <w:outlineLvl w:val="2"/>
-        <w:rPr>
-          <w:rFonts w:ascii="Times New Roman" w:eastAsia="Times New Roman" w:hAnsi="Times New Roman" w:cs="Times New Roman"/>
-          <w:bCs/>
-          <w:sz w:val="27"/>
-          <w:szCs w:val="27"/>
-        </w:rPr>
-      </w:pPr>
-      <w:r>
-        <w:rPr>
-          <w:rFonts w:ascii="Times New Roman" w:eastAsia="Times New Roman" w:hAnsi="Times New Roman" w:cs="Times New Roman"/>
-          <w:bCs/>
-          <w:sz w:val="27"/>
-          <w:szCs w:val="27"/>
+        <w:pStyle w:val="Heading1"/>
+        <w:rPr>
+          <w:rFonts w:eastAsia="Times New Roman"/>
+        </w:rPr>
+      </w:pPr>
+      <w:r>
+        <w:rPr>
+          <w:rFonts w:eastAsia="Times New Roman"/>
         </w:rPr>
         <w:t>Phần 2: Tầm quan trọng của chủ quyền biển đảo đối với Việt Nam</w:t>
       </w:r>
@@ -363,7 +361,16 @@
           <w:sz w:val="24"/>
           <w:szCs w:val="24"/>
         </w:rPr>
-        <w:t>Biển đảo Việt Nam có một tiềm năng kinh tế vô cùng to lớn. Vùng đặc quyền kinh tế và thềm lục địa của Việt Nam chứa đựng các nguồn tài nguyên biển phong phú, bao gồm dầu khí, thủy sản, và các tài nguyên khoáng sản. Bảo vệ chủ quyền biển đảo không chỉ giúp bảo vệ tài nguyên quốc gia mà còn thúc đẩy phát triển kinh tế biển bền vững.</w:t>
+        <w:t xml:space="preserve">Biển đảo Việt Nam có một tiềm năng kinh tế vô cùng to lớn. Vùng đặc quyền kinh tế và thềm lục địa của Việt Nam chứa đựng các nguồn tài nguyên biển phong </w:t>
+      </w:r>
+      <w:r>
+        <w:rPr>
+          <w:rFonts w:ascii="Times New Roman" w:eastAsia="Times New Roman" w:hAnsi="Times New Roman" w:cs="Times New Roman"/>
+          <w:sz w:val="24"/>
+          <w:szCs w:val="24"/>
+        </w:rPr>
+        <w:lastRenderedPageBreak/>
+        <w:t>phú, bao gồm dầu khí, thủy sản, và các tài nguyên khoáng sản. Bảo vệ chủ quyền biển đảo không chỉ giúp bảo vệ tài nguyên quốc gia mà còn thúc đẩy phát triển kinh tế biển bền vững.</w:t>
       </w:r>
     </w:p>
     <w:p>
@@ -385,7 +392,6 @@
           <w:sz w:val="24"/>
           <w:szCs w:val="24"/>
         </w:rPr>
-        <w:lastRenderedPageBreak/>
         <w:t>Các ngành kinh tế biển như du lịch, thủy sản, giao thông vận tải biển và dầu khí đóng góp không nhỏ vào nền kinh tế quốc gia. Việt Nam đang khai thác tiềm năng này để xây dựng nền kinh tế biển mạnh mẽ.</w:t>
       </w:r>
     </w:p>
@@ -446,21 +452,14 @@
     </w:p>
     <w:p>
       <w:pPr>
-        <w:spacing w:before="100" w:beforeAutospacing="1" w:after="100" w:afterAutospacing="1" w:line="240" w:lineRule="auto"/>
-        <w:outlineLvl w:val="2"/>
-        <w:rPr>
-          <w:rFonts w:ascii="Times New Roman" w:eastAsia="Times New Roman" w:hAnsi="Times New Roman" w:cs="Times New Roman"/>
-          <w:bCs/>
-          <w:sz w:val="27"/>
-          <w:szCs w:val="27"/>
-        </w:rPr>
-      </w:pPr>
-      <w:r>
-        <w:rPr>
-          <w:rFonts w:ascii="Times New Roman" w:eastAsia="Times New Roman" w:hAnsi="Times New Roman" w:cs="Times New Roman"/>
-          <w:bCs/>
-          <w:sz w:val="27"/>
-          <w:szCs w:val="27"/>
+        <w:pStyle w:val="Heading1"/>
+        <w:rPr>
+          <w:rFonts w:eastAsia="Times New Roman"/>
+        </w:rPr>
+      </w:pPr>
+      <w:r>
+        <w:rPr>
+          <w:rFonts w:eastAsia="Times New Roman"/>
         </w:rPr>
         <w:t>Phần 3: Thách thức trong việc bảo vệ chủ quyền biển đảo</w:t>
       </w:r>
@@ -612,21 +611,14 @@
     </w:p>
     <w:p>
       <w:pPr>
-        <w:spacing w:before="100" w:beforeAutospacing="1" w:after="100" w:afterAutospacing="1" w:line="240" w:lineRule="auto"/>
-        <w:outlineLvl w:val="2"/>
-        <w:rPr>
-          <w:rFonts w:ascii="Times New Roman" w:eastAsia="Times New Roman" w:hAnsi="Times New Roman" w:cs="Times New Roman"/>
-          <w:bCs/>
-          <w:sz w:val="27"/>
-          <w:szCs w:val="27"/>
-        </w:rPr>
-      </w:pPr>
-      <w:r>
-        <w:rPr>
-          <w:rFonts w:ascii="Times New Roman" w:eastAsia="Times New Roman" w:hAnsi="Times New Roman" w:cs="Times New Roman"/>
-          <w:bCs/>
-          <w:sz w:val="27"/>
-          <w:szCs w:val="27"/>
+        <w:pStyle w:val="Heading1"/>
+        <w:rPr>
+          <w:rFonts w:eastAsia="Times New Roman"/>
+        </w:rPr>
+      </w:pPr>
+      <w:r>
+        <w:rPr>
+          <w:rFonts w:eastAsia="Times New Roman"/>
         </w:rPr>
         <w:t>Phần 4: Giải pháp và hướng đi trong bảo vệ chủ quyền biển đảo</w:t>
       </w:r>
@@ -741,6 +733,7 @@
           <w:sz w:val="24"/>
           <w:szCs w:val="24"/>
         </w:rPr>
+        <w:lastRenderedPageBreak/>
         <w:t>Nâng cao nhận thức cộng đồng</w:t>
       </w:r>
     </w:p>
@@ -763,16 +756,7 @@
           <w:sz w:val="24"/>
           <w:szCs w:val="24"/>
         </w:rPr>
-        <w:t xml:space="preserve">Việc tuyên truyền, giáo dục về chủ quyền biển đảo cần được thực hiện rộng rãi qua các kênh truyền thông, sách vở, chương trình học, và các hoạt động cộng </w:t>
-      </w:r>
-      <w:r>
-        <w:rPr>
-          <w:rFonts w:ascii="Times New Roman" w:eastAsia="Times New Roman" w:hAnsi="Times New Roman" w:cs="Times New Roman"/>
-          <w:sz w:val="24"/>
-          <w:szCs w:val="24"/>
-        </w:rPr>
-        <w:lastRenderedPageBreak/>
-        <w:t>đồng để mỗi công dân hiểu rõ trách nhiệm của mình trong việc bảo vệ chủ quyền quốc gia.</w:t>
+        <w:t>Việc tuyên truyền, giáo dục về chủ quyền biển đảo cần được thực hiện rộng rãi qua các kênh truyền thông, sách vở, chương trình học, và các hoạt động cộng đồng để mỗi công dân hiểu rõ trách nhiệm của mình trong việc bảo vệ chủ quyền quốc gia.</w:t>
       </w:r>
     </w:p>
     <w:p>
@@ -832,21 +816,14 @@
     </w:p>
     <w:p>
       <w:pPr>
-        <w:spacing w:before="100" w:beforeAutospacing="1" w:after="100" w:afterAutospacing="1" w:line="240" w:lineRule="auto"/>
-        <w:outlineLvl w:val="2"/>
-        <w:rPr>
-          <w:rFonts w:ascii="Times New Roman" w:eastAsia="Times New Roman" w:hAnsi="Times New Roman" w:cs="Times New Roman"/>
-          <w:bCs/>
-          <w:sz w:val="27"/>
-          <w:szCs w:val="27"/>
-        </w:rPr>
-      </w:pPr>
-      <w:r>
-        <w:rPr>
-          <w:rFonts w:ascii="Times New Roman" w:eastAsia="Times New Roman" w:hAnsi="Times New Roman" w:cs="Times New Roman"/>
-          <w:bCs/>
-          <w:sz w:val="27"/>
-          <w:szCs w:val="27"/>
+        <w:pStyle w:val="Heading1"/>
+        <w:rPr>
+          <w:rFonts w:eastAsia="Times New Roman"/>
+        </w:rPr>
+      </w:pPr>
+      <w:r>
+        <w:rPr>
+          <w:rFonts w:eastAsia="Times New Roman"/>
         </w:rPr>
         <w:t>Kết luận</w:t>
       </w:r>
@@ -980,8 +957,58 @@
 </w:document>
 </file>
 
+<file path=word/endnotes.xml><?xml version="1.0" encoding="utf-8"?>
+<w:endnotes xmlns:wpc="http://schemas.microsoft.com/office/word/2010/wordprocessingCanvas" xmlns:cx="http://schemas.microsoft.com/office/drawing/2014/chartex" xmlns:cx1="http://schemas.microsoft.com/office/drawing/2015/9/8/chartex" xmlns:cx2="http://schemas.microsoft.com/office/drawing/2015/10/21/chartex" xmlns:cx3="http://schemas.microsoft.com/office/drawing/2016/5/9/chartex" xmlns:cx4="http://schemas.microsoft.com/office/drawing/2016/5/10/chartex" xmlns:cx5="http://schemas.microsoft.com/office/drawing/2016/5/11/chartex" xmlns:cx6="http://schemas.microsoft.com/office/drawing/2016/5/12/chartex" xmlns:cx7="http://schemas.microsoft.com/office/drawing/2016/5/13/chartex" xmlns:cx8="http://schemas.microsoft.com/office/drawing/2016/5/14/chartex" xmlns:mc="http://schemas.openxmlformats.org/markup-compatibility/2006" xmlns:aink="http://schemas.microsoft.com/office/drawing/2016/ink" xmlns:am3d="http://schemas.microsoft.com/office/drawing/2017/model3d" xmlns:o="urn:schemas-microsoft-com:office:office" xmlns:oel="http://schemas.microsoft.com/office/2019/extlst" xmlns:r="http://schemas.openxmlformats.org/officeDocument/2006/relationships" xmlns:m="http://schemas.openxmlformats.org/officeDocument/2006/math" xmlns:v="urn:schemas-microsoft-com:vml" xmlns:wp14="http://schemas.microsoft.com/office/word/2010/wordprocessingDrawing" xmlns:wp="http://schemas.openxmlformats.org/drawingml/2006/wordprocessingDrawing" xmlns:w10="urn:schemas-microsoft-com:office:word" xmlns:w="http://schemas.openxmlformats.org/wordprocessingml/2006/main" xmlns:w14="http://schemas.microsoft.com/office/word/2010/wordml" xmlns:w15="http://schemas.microsoft.com/office/word/2012/wordml" xmlns:w16cex="http://schemas.microsoft.com/office/word/2018/wordml/cex" xmlns:w16cid="http://schemas.microsoft.com/office/word/2016/wordml/cid" xmlns:w16="http://schemas.microsoft.com/office/word/2018/wordml" xmlns:w16sdtdh="http://schemas.microsoft.com/office/word/2020/wordml/sdtdatahash" xmlns:w16se="http://schemas.microsoft.com/office/word/2015/wordml/symex" xmlns:wpg="http://schemas.microsoft.com/office/word/2010/wordprocessingGroup" xmlns:wpi="http://schemas.microsoft.com/office/word/2010/wordprocessingInk" xmlns:wne="http://schemas.microsoft.com/office/word/2006/wordml" xmlns:wps="http://schemas.microsoft.com/office/word/2010/wordprocessingShape" mc:Ignorable="w14 w15 w16se w16cid w16 w16cex w16sdtdh wp14">
+  <w:endnote w:type="separator" w:id="-1">
+    <w:p>
+      <w:pPr>
+        <w:spacing w:after="0" w:line="240" w:lineRule="auto"/>
+      </w:pPr>
+      <w:r>
+        <w:separator/>
+      </w:r>
+    </w:p>
+  </w:endnote>
+  <w:endnote w:type="continuationSeparator" w:id="0">
+    <w:p>
+      <w:pPr>
+        <w:spacing w:after="0" w:line="240" w:lineRule="auto"/>
+      </w:pPr>
+      <w:r>
+        <w:continuationSeparator/>
+      </w:r>
+    </w:p>
+  </w:endnote>
+</w:endnotes>
+</file>
+
+<file path=word/footnotes.xml><?xml version="1.0" encoding="utf-8"?>
+<w:footnotes xmlns:wpc="http://schemas.microsoft.com/office/word/2010/wordprocessingCanvas" xmlns:cx="http://schemas.microsoft.com/office/drawing/2014/chartex" xmlns:cx1="http://schemas.microsoft.com/office/drawing/2015/9/8/chartex" xmlns:cx2="http://schemas.microsoft.com/office/drawing/2015/10/21/chartex" xmlns:cx3="http://schemas.microsoft.com/office/drawing/2016/5/9/chartex" xmlns:cx4="http://schemas.microsoft.com/office/drawing/2016/5/10/chartex" xmlns:cx5="http://schemas.microsoft.com/office/drawing/2016/5/11/chartex" xmlns:cx6="http://schemas.microsoft.com/office/drawing/2016/5/12/chartex" xmlns:cx7="http://schemas.microsoft.com/office/drawing/2016/5/13/chartex" xmlns:cx8="http://schemas.microsoft.com/office/drawing/2016/5/14/chartex" xmlns:mc="http://schemas.openxmlformats.org/markup-compatibility/2006" xmlns:aink="http://schemas.microsoft.com/office/drawing/2016/ink" xmlns:am3d="http://schemas.microsoft.com/office/drawing/2017/model3d" xmlns:o="urn:schemas-microsoft-com:office:office" xmlns:oel="http://schemas.microsoft.com/office/2019/extlst" xmlns:r="http://schemas.openxmlformats.org/officeDocument/2006/relationships" xmlns:m="http://schemas.openxmlformats.org/officeDocument/2006/math" xmlns:v="urn:schemas-microsoft-com:vml" xmlns:wp14="http://schemas.microsoft.com/office/word/2010/wordprocessingDrawing" xmlns:wp="http://schemas.openxmlformats.org/drawingml/2006/wordprocessingDrawing" xmlns:w10="urn:schemas-microsoft-com:office:word" xmlns:w="http://schemas.openxmlformats.org/wordprocessingml/2006/main" xmlns:w14="http://schemas.microsoft.com/office/word/2010/wordml" xmlns:w15="http://schemas.microsoft.com/office/word/2012/wordml" xmlns:w16cex="http://schemas.microsoft.com/office/word/2018/wordml/cex" xmlns:w16cid="http://schemas.microsoft.com/office/word/2016/wordml/cid" xmlns:w16="http://schemas.microsoft.com/office/word/2018/wordml" xmlns:w16sdtdh="http://schemas.microsoft.com/office/word/2020/wordml/sdtdatahash" xmlns:w16se="http://schemas.microsoft.com/office/word/2015/wordml/symex" xmlns:wpg="http://schemas.microsoft.com/office/word/2010/wordprocessingGroup" xmlns:wpi="http://schemas.microsoft.com/office/word/2010/wordprocessingInk" xmlns:wne="http://schemas.microsoft.com/office/word/2006/wordml" xmlns:wps="http://schemas.microsoft.com/office/word/2010/wordprocessingShape" mc:Ignorable="w14 w15 w16se w16cid w16 w16cex w16sdtdh wp14">
+  <w:footnote w:type="separator" w:id="-1">
+    <w:p>
+      <w:pPr>
+        <w:spacing w:after="0" w:line="240" w:lineRule="auto"/>
+      </w:pPr>
+      <w:r>
+        <w:separator/>
+      </w:r>
+    </w:p>
+  </w:footnote>
+  <w:footnote w:type="continuationSeparator" w:id="0">
+    <w:p>
+      <w:pPr>
+        <w:spacing w:after="0" w:line="240" w:lineRule="auto"/>
+      </w:pPr>
+      <w:r>
+        <w:continuationSeparator/>
+      </w:r>
+    </w:p>
+  </w:footnote>
+</w:footnotes>
+</file>
+
 <file path=word/numbering.xml><?xml version="1.0" encoding="utf-8"?>
-<w:numbering xmlns:wpc="http://schemas.microsoft.com/office/word/2010/wordprocessingCanvas" xmlns:cx="http://schemas.microsoft.com/office/drawing/2014/chartex" xmlns:mc="http://schemas.openxmlformats.org/markup-compatibility/2006" xmlns:o="urn:schemas-microsoft-com:office:office" xmlns:r="http://schemas.openxmlformats.org/officeDocument/2006/relationships" xmlns:m="http://schemas.openxmlformats.org/officeDocument/2006/math" xmlns:v="urn:schemas-microsoft-com:vml" xmlns:wp14="http://schemas.microsoft.com/office/word/2010/wordprocessingDrawing" xmlns:wp="http://schemas.openxmlformats.org/drawingml/2006/wordprocessingDrawing" xmlns:w10="urn:schemas-microsoft-com:office:word" xmlns:w="http://schemas.openxmlformats.org/wordprocessingml/2006/main" xmlns:w14="http://schemas.microsoft.com/office/word/2010/wordml" xmlns:w15="http://schemas.microsoft.com/office/word/2012/wordml" xmlns:w16se="http://schemas.microsoft.com/office/word/2015/wordml/symex" xmlns:wpg="http://schemas.microsoft.com/office/word/2010/wordprocessingGroup" xmlns:wpi="http://schemas.microsoft.com/office/word/2010/wordprocessingInk" xmlns:wne="http://schemas.microsoft.com/office/word/2006/wordml" xmlns:wps="http://schemas.microsoft.com/office/word/2010/wordprocessingShape" mc:Ignorable="w14 w15 w16se wp14">
+<w:numbering xmlns:wpc="http://schemas.microsoft.com/office/word/2010/wordprocessingCanvas" xmlns:cx="http://schemas.microsoft.com/office/drawing/2014/chartex" xmlns:cx1="http://schemas.microsoft.com/office/drawing/2015/9/8/chartex" xmlns:cx2="http://schemas.microsoft.com/office/drawing/2015/10/21/chartex" xmlns:cx3="http://schemas.microsoft.com/office/drawing/2016/5/9/chartex" xmlns:cx4="http://schemas.microsoft.com/office/drawing/2016/5/10/chartex" xmlns:cx5="http://schemas.microsoft.com/office/drawing/2016/5/11/chartex" xmlns:cx6="http://schemas.microsoft.com/office/drawing/2016/5/12/chartex" xmlns:cx7="http://schemas.microsoft.com/office/drawing/2016/5/13/chartex" xmlns:cx8="http://schemas.microsoft.com/office/drawing/2016/5/14/chartex" xmlns:mc="http://schemas.openxmlformats.org/markup-compatibility/2006" xmlns:aink="http://schemas.microsoft.com/office/drawing/2016/ink" xmlns:am3d="http://schemas.microsoft.com/office/drawing/2017/model3d" xmlns:o="urn:schemas-microsoft-com:office:office" xmlns:oel="http://schemas.microsoft.com/office/2019/extlst" xmlns:r="http://schemas.openxmlformats.org/officeDocument/2006/relationships" xmlns:m="http://schemas.openxmlformats.org/officeDocument/2006/math" xmlns:v="urn:schemas-microsoft-com:vml" xmlns:wp14="http://schemas.microsoft.com/office/word/2010/wordprocessingDrawing" xmlns:wp="http://schemas.openxmlformats.org/drawingml/2006/wordprocessingDrawing" xmlns:w10="urn:schemas-microsoft-com:office:word" xmlns:w="http://schemas.openxmlformats.org/wordprocessingml/2006/main" xmlns:w14="http://schemas.microsoft.com/office/word/2010/wordml" xmlns:w15="http://schemas.microsoft.com/office/word/2012/wordml" xmlns:w16cex="http://schemas.microsoft.com/office/word/2018/wordml/cex" xmlns:w16cid="http://schemas.microsoft.com/office/word/2016/wordml/cid" xmlns:w16="http://schemas.microsoft.com/office/word/2018/wordml" xmlns:w16sdtdh="http://schemas.microsoft.com/office/word/2020/wordml/sdtdatahash" xmlns:w16se="http://schemas.microsoft.com/office/word/2015/wordml/symex" xmlns:wpg="http://schemas.microsoft.com/office/word/2010/wordprocessingGroup" xmlns:wpi="http://schemas.microsoft.com/office/word/2010/wordprocessingInk" xmlns:wne="http://schemas.microsoft.com/office/word/2006/wordml" xmlns:wps="http://schemas.microsoft.com/office/word/2010/wordprocessingShape" mc:Ignorable="w14 w15 w16se w16cid w16 w16cex w16sdtdh wp14">
   <w:abstractNum w:abstractNumId="0" w15:restartNumberingAfterBreak="0">
     <w:nsid w:val="096A6448"/>
     <w:multiLevelType w:val="multilevel"/>
@@ -1688,29 +1715,29 @@
       </w:pPr>
     </w:lvl>
   </w:abstractNum>
-  <w:num w:numId="1">
+  <w:num w:numId="1" w16cid:durableId="987251398">
     <w:abstractNumId w:val="4"/>
   </w:num>
-  <w:num w:numId="2">
+  <w:num w:numId="2" w16cid:durableId="1815025299">
     <w:abstractNumId w:val="2"/>
   </w:num>
-  <w:num w:numId="3">
+  <w:num w:numId="3" w16cid:durableId="178814406">
     <w:abstractNumId w:val="3"/>
   </w:num>
-  <w:num w:numId="4">
+  <w:num w:numId="4" w16cid:durableId="107816180">
     <w:abstractNumId w:val="0"/>
   </w:num>
-  <w:num w:numId="5">
+  <w:num w:numId="5" w16cid:durableId="420294037">
     <w:abstractNumId w:val="1"/>
   </w:num>
-  <w:num w:numId="6">
+  <w:num w:numId="6" w16cid:durableId="817310294">
     <w:abstractNumId w:val="5"/>
   </w:num>
 </w:numbering>
 </file>
 
 <file path=word/styles.xml><?xml version="1.0" encoding="utf-8"?>
-<w:styles xmlns:mc="http://schemas.openxmlformats.org/markup-compatibility/2006" xmlns:r="http://schemas.openxmlformats.org/officeDocument/2006/relationships" xmlns:w="http://schemas.openxmlformats.org/wordprocessingml/2006/main" xmlns:w14="http://schemas.microsoft.com/office/word/2010/wordml" xmlns:w15="http://schemas.microsoft.com/office/word/2012/wordml" xmlns:w16se="http://schemas.microsoft.com/office/word/2015/wordml/symex" mc:Ignorable="w14 w15 w16se">
+<w:styles xmlns:mc="http://schemas.openxmlformats.org/markup-compatibility/2006" xmlns:r="http://schemas.openxmlformats.org/officeDocument/2006/relationships" xmlns:w="http://schemas.openxmlformats.org/wordprocessingml/2006/main" xmlns:w14="http://schemas.microsoft.com/office/word/2010/wordml" xmlns:w15="http://schemas.microsoft.com/office/word/2012/wordml" xmlns:w16cex="http://schemas.microsoft.com/office/word/2018/wordml/cex" xmlns:w16cid="http://schemas.microsoft.com/office/word/2016/wordml/cid" xmlns:w16="http://schemas.microsoft.com/office/word/2018/wordml" xmlns:w16sdtdh="http://schemas.microsoft.com/office/word/2020/wordml/sdtdatahash" xmlns:w16se="http://schemas.microsoft.com/office/word/2015/wordml/symex" mc:Ignorable="w14 w15 w16se w16cid w16 w16cex w16sdtdh">
   <w:docDefaults>
     <w:rPrDefault>
       <w:rPr>
@@ -1726,7 +1753,7 @@
       </w:pPr>
     </w:pPrDefault>
   </w:docDefaults>
-  <w:latentStyles w:defLockedState="0" w:defUIPriority="99" w:defSemiHidden="0" w:defUnhideWhenUsed="0" w:defQFormat="0" w:count="371">
+  <w:latentStyles w:defLockedState="0" w:defUIPriority="99" w:defSemiHidden="0" w:defUnhideWhenUsed="0" w:defQFormat="0" w:count="376">
     <w:lsdException w:name="Normal" w:uiPriority="0" w:qFormat="1"/>
     <w:lsdException w:name="heading 1" w:uiPriority="9" w:qFormat="1"/>
     <w:lsdException w:name="heading 2" w:semiHidden="1" w:uiPriority="9" w:unhideWhenUsed="1" w:qFormat="1"/>
@@ -2098,10 +2125,36 @@
     <w:lsdException w:name="List Table 5 Dark Accent 6" w:uiPriority="50"/>
     <w:lsdException w:name="List Table 6 Colorful Accent 6" w:uiPriority="51"/>
     <w:lsdException w:name="List Table 7 Colorful Accent 6" w:uiPriority="52"/>
+    <w:lsdException w:name="Mention" w:semiHidden="1" w:unhideWhenUsed="1"/>
+    <w:lsdException w:name="Smart Hyperlink" w:semiHidden="1" w:unhideWhenUsed="1"/>
+    <w:lsdException w:name="Hashtag" w:semiHidden="1" w:unhideWhenUsed="1"/>
+    <w:lsdException w:name="Unresolved Mention" w:semiHidden="1" w:unhideWhenUsed="1"/>
+    <w:lsdException w:name="Smart Link" w:semiHidden="1" w:unhideWhenUsed="1"/>
   </w:latentStyles>
   <w:style w:type="paragraph" w:default="1" w:styleId="Normal">
     <w:name w:val="Normal"/>
     <w:qFormat/>
+  </w:style>
+  <w:style w:type="paragraph" w:styleId="Heading1">
+    <w:name w:val="heading 1"/>
+    <w:basedOn w:val="Normal"/>
+    <w:next w:val="Normal"/>
+    <w:link w:val="Heading1Char"/>
+    <w:uiPriority w:val="9"/>
+    <w:qFormat/>
+    <w:rsid w:val="00935975"/>
+    <w:pPr>
+      <w:keepNext/>
+      <w:keepLines/>
+      <w:spacing w:before="240" w:after="0"/>
+      <w:outlineLvl w:val="0"/>
+    </w:pPr>
+    <w:rPr>
+      <w:rFonts w:asciiTheme="majorHAnsi" w:eastAsiaTheme="majorEastAsia" w:hAnsiTheme="majorHAnsi" w:cstheme="majorBidi"/>
+      <w:color w:val="2E74B5" w:themeColor="accent1" w:themeShade="BF"/>
+      <w:sz w:val="32"/>
+      <w:szCs w:val="32"/>
+    </w:rPr>
   </w:style>
   <w:style w:type="paragraph" w:styleId="Heading3">
     <w:name w:val="heading 3"/>
@@ -2172,6 +2225,97 @@
     <w:rPr>
       <w:b/>
       <w:bCs/>
+    </w:rPr>
+  </w:style>
+  <w:style w:type="paragraph" w:styleId="Header">
+    <w:name w:val="header"/>
+    <w:basedOn w:val="Normal"/>
+    <w:link w:val="HeaderChar"/>
+    <w:uiPriority w:val="99"/>
+    <w:unhideWhenUsed/>
+    <w:rsid w:val="00935975"/>
+    <w:pPr>
+      <w:tabs>
+        <w:tab w:val="center" w:pos="4513"/>
+        <w:tab w:val="right" w:pos="9026"/>
+      </w:tabs>
+      <w:spacing w:after="0" w:line="240" w:lineRule="auto"/>
+    </w:pPr>
+  </w:style>
+  <w:style w:type="character" w:customStyle="1" w:styleId="HeaderChar">
+    <w:name w:val="Header Char"/>
+    <w:basedOn w:val="DefaultParagraphFont"/>
+    <w:link w:val="Header"/>
+    <w:uiPriority w:val="99"/>
+    <w:rsid w:val="00935975"/>
+  </w:style>
+  <w:style w:type="paragraph" w:styleId="Footer">
+    <w:name w:val="footer"/>
+    <w:basedOn w:val="Normal"/>
+    <w:link w:val="FooterChar"/>
+    <w:uiPriority w:val="99"/>
+    <w:unhideWhenUsed/>
+    <w:rsid w:val="00935975"/>
+    <w:pPr>
+      <w:tabs>
+        <w:tab w:val="center" w:pos="4513"/>
+        <w:tab w:val="right" w:pos="9026"/>
+      </w:tabs>
+      <w:spacing w:after="0" w:line="240" w:lineRule="auto"/>
+    </w:pPr>
+  </w:style>
+  <w:style w:type="character" w:customStyle="1" w:styleId="FooterChar">
+    <w:name w:val="Footer Char"/>
+    <w:basedOn w:val="DefaultParagraphFont"/>
+    <w:link w:val="Footer"/>
+    <w:uiPriority w:val="99"/>
+    <w:rsid w:val="00935975"/>
+  </w:style>
+  <w:style w:type="paragraph" w:styleId="Title">
+    <w:name w:val="Title"/>
+    <w:basedOn w:val="Normal"/>
+    <w:next w:val="Normal"/>
+    <w:link w:val="TitleChar"/>
+    <w:uiPriority w:val="10"/>
+    <w:qFormat/>
+    <w:rsid w:val="00935975"/>
+    <w:pPr>
+      <w:spacing w:after="0" w:line="240" w:lineRule="auto"/>
+      <w:contextualSpacing/>
+    </w:pPr>
+    <w:rPr>
+      <w:rFonts w:asciiTheme="majorHAnsi" w:eastAsiaTheme="majorEastAsia" w:hAnsiTheme="majorHAnsi" w:cstheme="majorBidi"/>
+      <w:spacing w:val="-10"/>
+      <w:kern w:val="28"/>
+      <w:sz w:val="56"/>
+      <w:szCs w:val="56"/>
+    </w:rPr>
+  </w:style>
+  <w:style w:type="character" w:customStyle="1" w:styleId="TitleChar">
+    <w:name w:val="Title Char"/>
+    <w:basedOn w:val="DefaultParagraphFont"/>
+    <w:link w:val="Title"/>
+    <w:uiPriority w:val="10"/>
+    <w:rsid w:val="00935975"/>
+    <w:rPr>
+      <w:rFonts w:asciiTheme="majorHAnsi" w:eastAsiaTheme="majorEastAsia" w:hAnsiTheme="majorHAnsi" w:cstheme="majorBidi"/>
+      <w:spacing w:val="-10"/>
+      <w:kern w:val="28"/>
+      <w:sz w:val="56"/>
+      <w:szCs w:val="56"/>
+    </w:rPr>
+  </w:style>
+  <w:style w:type="character" w:customStyle="1" w:styleId="Heading1Char">
+    <w:name w:val="Heading 1 Char"/>
+    <w:basedOn w:val="DefaultParagraphFont"/>
+    <w:link w:val="Heading1"/>
+    <w:uiPriority w:val="9"/>
+    <w:rsid w:val="00935975"/>
+    <w:rPr>
+      <w:rFonts w:asciiTheme="majorHAnsi" w:eastAsiaTheme="majorEastAsia" w:hAnsiTheme="majorHAnsi" w:cstheme="majorBidi"/>
+      <w:color w:val="2E74B5" w:themeColor="accent1" w:themeShade="BF"/>
+      <w:sz w:val="32"/>
+      <w:szCs w:val="32"/>
     </w:rPr>
   </w:style>
 </w:styles>

</xml_diff>